<commit_message>
Actualizar informe integral y evidencias de la Actividad 4
</commit_message>
<xml_diff>
--- a/Informe_Configuracion_Arquitectura_Base_Datos_Palma_Verde.docx
+++ b/Informe_Configuracion_Arquitectura_Base_Datos_Palma_Verde.docx
@@ -2657,6 +2657,448 @@
         <w:t>La IA se utilizó como herramienta de apoyo. La selección final de arquitectura, las validaciones de seguridad y la aceptación de los resultados fueron responsabilidad del desarrollador.</w:t>
       </w:r>
     </w:p>
+    <w:p>
+      <w:pPr>
+        <w:pStyle w:val="Heading1"/>
+      </w:pPr>
+      <w:r>
+        <w:t>14. Evidencias de pruebas con Postman</w:t>
+      </w:r>
+    </w:p>
+    <w:p>
+      <w:r>
+        <w:t>Las siguientes capturas corresponden a la ejecución local de la colección Palma Verde API. Los tokens JWT y los paneles con variables sensibles fueron ocultados antes de incorporar las evidencias al informe.</w:t>
+      </w:r>
+    </w:p>
+    <w:p>
+      <w:pPr>
+        <w:jc w:val="center"/>
+      </w:pPr>
+      <w:r>
+        <w:drawing>
+          <wp:inline xmlns:a="http://schemas.openxmlformats.org/drawingml/2006/main" xmlns:pic="http://schemas.openxmlformats.org/drawingml/2006/picture">
+            <wp:extent cx="5897880" cy="3088865"/>
+            <wp:docPr id="2" name="Picture 2" descr="Figura 2. Login correcto del Administrador: la API respondió HTTP 200 y emitió un JWT."/>
+            <wp:cNvGraphicFramePr>
+              <a:graphicFrameLocks noChangeAspect="1"/>
+            </wp:cNvGraphicFramePr>
+            <a:graphic>
+              <a:graphicData uri="http://schemas.openxmlformats.org/drawingml/2006/picture">
+                <pic:pic>
+                  <pic:nvPicPr>
+                    <pic:cNvPr id="0" name="postman_01.png"/>
+                    <pic:cNvPicPr/>
+                  </pic:nvPicPr>
+                  <pic:blipFill>
+                    <a:blip r:embed="rId12"/>
+                    <a:stretch>
+                      <a:fillRect/>
+                    </a:stretch>
+                  </pic:blipFill>
+                  <pic:spPr>
+                    <a:xfrm>
+                      <a:off x="0" y="0"/>
+                      <a:ext cx="5897880" cy="3088865"/>
+                    </a:xfrm>
+                    <a:prstGeom prst="rect"/>
+                  </pic:spPr>
+                </pic:pic>
+              </a:graphicData>
+            </a:graphic>
+          </wp:inline>
+        </w:drawing>
+      </w:r>
+    </w:p>
+    <w:p>
+      <w:pPr>
+        <w:spacing w:after="160"/>
+        <w:jc w:val="center"/>
+      </w:pPr>
+      <w:r>
+        <w:rPr>
+          <w:rFonts w:ascii="Arial" w:hAnsi="Arial"/>
+          <w:i/>
+          <w:sz w:val="18"/>
+        </w:rPr>
+        <w:t>Figura 2. Login correcto del Administrador: la API respondió HTTP 200 y emitió un JWT.</w:t>
+      </w:r>
+    </w:p>
+    <w:p>
+      <w:pPr>
+        <w:jc w:val="center"/>
+      </w:pPr>
+      <w:r>
+        <w:drawing>
+          <wp:inline xmlns:a="http://schemas.openxmlformats.org/drawingml/2006/main" xmlns:pic="http://schemas.openxmlformats.org/drawingml/2006/picture">
+            <wp:extent cx="5897880" cy="3088865"/>
+            <wp:docPr id="3" name="Picture 3" descr="Figura 3. Login inválido: la API rechazó las credenciales incorrectas con HTTP 401."/>
+            <wp:cNvGraphicFramePr>
+              <a:graphicFrameLocks noChangeAspect="1"/>
+            </wp:cNvGraphicFramePr>
+            <a:graphic>
+              <a:graphicData uri="http://schemas.openxmlformats.org/drawingml/2006/picture">
+                <pic:pic>
+                  <pic:nvPicPr>
+                    <pic:cNvPr id="0" name="postman_02.png"/>
+                    <pic:cNvPicPr/>
+                  </pic:nvPicPr>
+                  <pic:blipFill>
+                    <a:blip r:embed="rId13"/>
+                    <a:stretch>
+                      <a:fillRect/>
+                    </a:stretch>
+                  </pic:blipFill>
+                  <pic:spPr>
+                    <a:xfrm>
+                      <a:off x="0" y="0"/>
+                      <a:ext cx="5897880" cy="3088865"/>
+                    </a:xfrm>
+                    <a:prstGeom prst="rect"/>
+                  </pic:spPr>
+                </pic:pic>
+              </a:graphicData>
+            </a:graphic>
+          </wp:inline>
+        </w:drawing>
+      </w:r>
+    </w:p>
+    <w:p>
+      <w:pPr>
+        <w:spacing w:after="160"/>
+        <w:jc w:val="center"/>
+      </w:pPr>
+      <w:r>
+        <w:rPr>
+          <w:rFonts w:ascii="Arial" w:hAnsi="Arial"/>
+          <w:i/>
+          <w:sz w:val="18"/>
+        </w:rPr>
+        <w:t>Figura 3. Login inválido: la API rechazó las credenciales incorrectas con HTTP 401.</w:t>
+      </w:r>
+    </w:p>
+    <w:p>
+      <w:pPr>
+        <w:jc w:val="center"/>
+      </w:pPr>
+      <w:r>
+        <w:drawing>
+          <wp:inline xmlns:a="http://schemas.openxmlformats.org/drawingml/2006/main" xmlns:pic="http://schemas.openxmlformats.org/drawingml/2006/picture">
+            <wp:extent cx="5897880" cy="3091172"/>
+            <wp:docPr id="4" name="Picture 4" descr="Figura 4. Acceso sin token: el endpoint protegido de usuarios respondió HTTP 401."/>
+            <wp:cNvGraphicFramePr>
+              <a:graphicFrameLocks noChangeAspect="1"/>
+            </wp:cNvGraphicFramePr>
+            <a:graphic>
+              <a:graphicData uri="http://schemas.openxmlformats.org/drawingml/2006/picture">
+                <pic:pic>
+                  <pic:nvPicPr>
+                    <pic:cNvPr id="0" name="postman_03.png"/>
+                    <pic:cNvPicPr/>
+                  </pic:nvPicPr>
+                  <pic:blipFill>
+                    <a:blip r:embed="rId14"/>
+                    <a:stretch>
+                      <a:fillRect/>
+                    </a:stretch>
+                  </pic:blipFill>
+                  <pic:spPr>
+                    <a:xfrm>
+                      <a:off x="0" y="0"/>
+                      <a:ext cx="5897880" cy="3091172"/>
+                    </a:xfrm>
+                    <a:prstGeom prst="rect"/>
+                  </pic:spPr>
+                </pic:pic>
+              </a:graphicData>
+            </a:graphic>
+          </wp:inline>
+        </w:drawing>
+      </w:r>
+    </w:p>
+    <w:p>
+      <w:pPr>
+        <w:spacing w:after="160"/>
+        <w:jc w:val="center"/>
+      </w:pPr>
+      <w:r>
+        <w:rPr>
+          <w:rFonts w:ascii="Arial" w:hAnsi="Arial"/>
+          <w:i/>
+          <w:sz w:val="18"/>
+        </w:rPr>
+        <w:t>Figura 4. Acceso sin token: el endpoint protegido de usuarios respondió HTTP 401.</w:t>
+      </w:r>
+    </w:p>
+    <w:p>
+      <w:pPr>
+        <w:jc w:val="center"/>
+      </w:pPr>
+      <w:r>
+        <w:drawing>
+          <wp:inline xmlns:a="http://schemas.openxmlformats.org/drawingml/2006/main" xmlns:pic="http://schemas.openxmlformats.org/drawingml/2006/picture">
+            <wp:extent cx="5897880" cy="3088865"/>
+            <wp:docPr id="5" name="Picture 5" descr="Figura 5. Acceso con JWT de Administrador: la API respondió HTTP 200 y no expuso PasswordHash."/>
+            <wp:cNvGraphicFramePr>
+              <a:graphicFrameLocks noChangeAspect="1"/>
+            </wp:cNvGraphicFramePr>
+            <a:graphic>
+              <a:graphicData uri="http://schemas.openxmlformats.org/drawingml/2006/picture">
+                <pic:pic>
+                  <pic:nvPicPr>
+                    <pic:cNvPr id="0" name="postman_04.png"/>
+                    <pic:cNvPicPr/>
+                  </pic:nvPicPr>
+                  <pic:blipFill>
+                    <a:blip r:embed="rId15"/>
+                    <a:stretch>
+                      <a:fillRect/>
+                    </a:stretch>
+                  </pic:blipFill>
+                  <pic:spPr>
+                    <a:xfrm>
+                      <a:off x="0" y="0"/>
+                      <a:ext cx="5897880" cy="3088865"/>
+                    </a:xfrm>
+                    <a:prstGeom prst="rect"/>
+                  </pic:spPr>
+                </pic:pic>
+              </a:graphicData>
+            </a:graphic>
+          </wp:inline>
+        </w:drawing>
+      </w:r>
+    </w:p>
+    <w:p>
+      <w:pPr>
+        <w:spacing w:after="160"/>
+        <w:jc w:val="center"/>
+      </w:pPr>
+      <w:r>
+        <w:rPr>
+          <w:rFonts w:ascii="Arial" w:hAnsi="Arial"/>
+          <w:i/>
+          <w:sz w:val="18"/>
+        </w:rPr>
+        <w:t>Figura 5. Acceso con JWT de Administrador: la API respondió HTTP 200 y no expuso PasswordHash.</w:t>
+      </w:r>
+    </w:p>
+    <w:p>
+      <w:pPr>
+        <w:jc w:val="center"/>
+      </w:pPr>
+      <w:r>
+        <w:drawing>
+          <wp:inline xmlns:a="http://schemas.openxmlformats.org/drawingml/2006/main" xmlns:pic="http://schemas.openxmlformats.org/drawingml/2006/picture">
+            <wp:extent cx="5897880" cy="3088865"/>
+            <wp:docPr id="6" name="Picture 6" descr="Figura 6. Consulta autorizada de roles activos: la API respondió HTTP 200."/>
+            <wp:cNvGraphicFramePr>
+              <a:graphicFrameLocks noChangeAspect="1"/>
+            </wp:cNvGraphicFramePr>
+            <a:graphic>
+              <a:graphicData uri="http://schemas.openxmlformats.org/drawingml/2006/picture">
+                <pic:pic>
+                  <pic:nvPicPr>
+                    <pic:cNvPr id="0" name="postman_05.png"/>
+                    <pic:cNvPicPr/>
+                  </pic:nvPicPr>
+                  <pic:blipFill>
+                    <a:blip r:embed="rId16"/>
+                    <a:stretch>
+                      <a:fillRect/>
+                    </a:stretch>
+                  </pic:blipFill>
+                  <pic:spPr>
+                    <a:xfrm>
+                      <a:off x="0" y="0"/>
+                      <a:ext cx="5897880" cy="3088865"/>
+                    </a:xfrm>
+                    <a:prstGeom prst="rect"/>
+                  </pic:spPr>
+                </pic:pic>
+              </a:graphicData>
+            </a:graphic>
+          </wp:inline>
+        </w:drawing>
+      </w:r>
+    </w:p>
+    <w:p>
+      <w:pPr>
+        <w:spacing w:after="160"/>
+        <w:jc w:val="center"/>
+      </w:pPr>
+      <w:r>
+        <w:rPr>
+          <w:rFonts w:ascii="Arial" w:hAnsi="Arial"/>
+          <w:i/>
+          <w:sz w:val="18"/>
+        </w:rPr>
+        <w:t>Figura 6. Consulta autorizada de roles activos: la API respondió HTTP 200.</w:t>
+      </w:r>
+    </w:p>
+    <w:p>
+      <w:pPr>
+        <w:jc w:val="center"/>
+      </w:pPr>
+      <w:r>
+        <w:drawing>
+          <wp:inline xmlns:a="http://schemas.openxmlformats.org/drawingml/2006/main" xmlns:pic="http://schemas.openxmlformats.org/drawingml/2006/picture">
+            <wp:extent cx="5897880" cy="3084656"/>
+            <wp:docPr id="7" name="Picture 7" descr="Figura 7. Registro de usuario de prueba: la API respondió HTTP 200 y emitió credenciales protegidas."/>
+            <wp:cNvGraphicFramePr>
+              <a:graphicFrameLocks noChangeAspect="1"/>
+            </wp:cNvGraphicFramePr>
+            <a:graphic>
+              <a:graphicData uri="http://schemas.openxmlformats.org/drawingml/2006/picture">
+                <pic:pic>
+                  <pic:nvPicPr>
+                    <pic:cNvPr id="0" name="postman_06.png"/>
+                    <pic:cNvPicPr/>
+                  </pic:nvPicPr>
+                  <pic:blipFill>
+                    <a:blip r:embed="rId17"/>
+                    <a:stretch>
+                      <a:fillRect/>
+                    </a:stretch>
+                  </pic:blipFill>
+                  <pic:spPr>
+                    <a:xfrm>
+                      <a:off x="0" y="0"/>
+                      <a:ext cx="5897880" cy="3084656"/>
+                    </a:xfrm>
+                    <a:prstGeom prst="rect"/>
+                  </pic:spPr>
+                </pic:pic>
+              </a:graphicData>
+            </a:graphic>
+          </wp:inline>
+        </w:drawing>
+      </w:r>
+    </w:p>
+    <w:p>
+      <w:pPr>
+        <w:spacing w:after="160"/>
+        <w:jc w:val="center"/>
+      </w:pPr>
+      <w:r>
+        <w:rPr>
+          <w:rFonts w:ascii="Arial" w:hAnsi="Arial"/>
+          <w:i/>
+          <w:sz w:val="18"/>
+        </w:rPr>
+        <w:t>Figura 7. Registro de usuario de prueba: la API respondió HTTP 200 y emitió credenciales protegidas.</w:t>
+      </w:r>
+    </w:p>
+    <w:p>
+      <w:pPr>
+        <w:jc w:val="center"/>
+      </w:pPr>
+      <w:r>
+        <w:drawing>
+          <wp:inline xmlns:a="http://schemas.openxmlformats.org/drawingml/2006/main" xmlns:pic="http://schemas.openxmlformats.org/drawingml/2006/picture">
+            <wp:extent cx="5897880" cy="3088865"/>
+            <wp:docPr id="8" name="Picture 8" descr="Figura 8. Login correcto de Gerencia: la API respondió HTTP 200 y reconoció el rol."/>
+            <wp:cNvGraphicFramePr>
+              <a:graphicFrameLocks noChangeAspect="1"/>
+            </wp:cNvGraphicFramePr>
+            <a:graphic>
+              <a:graphicData uri="http://schemas.openxmlformats.org/drawingml/2006/picture">
+                <pic:pic>
+                  <pic:nvPicPr>
+                    <pic:cNvPr id="0" name="postman_07.png"/>
+                    <pic:cNvPicPr/>
+                  </pic:nvPicPr>
+                  <pic:blipFill>
+                    <a:blip r:embed="rId18"/>
+                    <a:stretch>
+                      <a:fillRect/>
+                    </a:stretch>
+                  </pic:blipFill>
+                  <pic:spPr>
+                    <a:xfrm>
+                      <a:off x="0" y="0"/>
+                      <a:ext cx="5897880" cy="3088865"/>
+                    </a:xfrm>
+                    <a:prstGeom prst="rect"/>
+                  </pic:spPr>
+                </pic:pic>
+              </a:graphicData>
+            </a:graphic>
+          </wp:inline>
+        </w:drawing>
+      </w:r>
+    </w:p>
+    <w:p>
+      <w:pPr>
+        <w:spacing w:after="160"/>
+        <w:jc w:val="center"/>
+      </w:pPr>
+      <w:r>
+        <w:rPr>
+          <w:rFonts w:ascii="Arial" w:hAnsi="Arial"/>
+          <w:i/>
+          <w:sz w:val="18"/>
+        </w:rPr>
+        <w:t>Figura 8. Login correcto de Gerencia: la API respondió HTTP 200 y reconoció el rol.</w:t>
+      </w:r>
+    </w:p>
+    <w:p>
+      <w:pPr>
+        <w:jc w:val="center"/>
+      </w:pPr>
+      <w:r>
+        <w:drawing>
+          <wp:inline xmlns:a="http://schemas.openxmlformats.org/drawingml/2006/main" xmlns:pic="http://schemas.openxmlformats.org/drawingml/2006/picture">
+            <wp:extent cx="5897880" cy="3088865"/>
+            <wp:docPr id="9" name="Picture 9" descr="Figura 9. Autorización por roles: Gerencia recibió HTTP 403 al intentar administrar usuarios."/>
+            <wp:cNvGraphicFramePr>
+              <a:graphicFrameLocks noChangeAspect="1"/>
+            </wp:cNvGraphicFramePr>
+            <a:graphic>
+              <a:graphicData uri="http://schemas.openxmlformats.org/drawingml/2006/picture">
+                <pic:pic>
+                  <pic:nvPicPr>
+                    <pic:cNvPr id="0" name="postman_08.png"/>
+                    <pic:cNvPicPr/>
+                  </pic:nvPicPr>
+                  <pic:blipFill>
+                    <a:blip r:embed="rId19"/>
+                    <a:stretch>
+                      <a:fillRect/>
+                    </a:stretch>
+                  </pic:blipFill>
+                  <pic:spPr>
+                    <a:xfrm>
+                      <a:off x="0" y="0"/>
+                      <a:ext cx="5897880" cy="3088865"/>
+                    </a:xfrm>
+                    <a:prstGeom prst="rect"/>
+                  </pic:spPr>
+                </pic:pic>
+              </a:graphicData>
+            </a:graphic>
+          </wp:inline>
+        </w:drawing>
+      </w:r>
+    </w:p>
+    <w:p>
+      <w:pPr>
+        <w:spacing w:after="160"/>
+        <w:jc w:val="center"/>
+      </w:pPr>
+      <w:r>
+        <w:rPr>
+          <w:rFonts w:ascii="Arial" w:hAnsi="Arial"/>
+          <w:i/>
+          <w:sz w:val="18"/>
+        </w:rPr>
+        <w:t>Figura 9. Autorización por roles: Gerencia recibió HTTP 403 al intentar administrar usuarios.</w:t>
+      </w:r>
+    </w:p>
+    <w:p>
+      <w:r>
+        <w:t>Resultado general: las ocho solicitudes produjeron los códigos esperados (200, 401 y 403), confirmando autenticación JWT, protección de endpoints, registro y autorización por roles.</w:t>
+      </w:r>
+    </w:p>
     <w:sectPr>
       <w:headerReference w:type="default" r:id="rId9"/>
       <w:footerReference w:type="default" r:id="rId10"/>

</xml_diff>